<commit_message>
v9.0.7: lock Workbench window size, hide Calculator minimise button
- Workbench 1 window can no longer be resized (locks to sizeHint()).
- Removed the OS minimise button from the Calculator window, matching
  the main window's existing behavior.
- Docs synced (article + tutorial docx/odt).
</commit_message>
<xml_diff>
--- a/article/PY-DIYCALCULATOR_Article_and_Tutorial.docx
+++ b/article/PY-DIYCALCULATOR_Article_and_Tutorial.docx
@@ -42,7 +42,7 @@
           <w:bCs w:val="false"/>
           <w:i/>
         </w:rPr>
-        <w:t>How PYYCALCULATOR brings a classic computing education project to life on the world's favourite single-board computer</w:t>
+        <w:t>How PY-DIYCALCULATOR brings a classic computing education project to life on the world's favourite single-board computer</w:t>
       </w:r>
     </w:p>
     <w:p>
@@ -238,24 +238,16 @@
       <w:r>
         <w:rPr/>
         <w:drawing>
-          <wp:anchor distT="0" distB="0" distL="0" distR="0" simplePos="0" relativeHeight="10" behindDoc="0" locked="0" layoutInCell="0" allowOverlap="1">
-            <wp:simplePos x="0" y="0"/>
-            <wp:positionH relativeFrom="column">
-              <wp:align>center</wp:align>
-            </wp:positionH>
-            <wp:positionV relativeFrom="paragraph">
-              <wp:posOffset>635</wp:posOffset>
-            </wp:positionV>
+          <wp:inline distT="0" distB="0" distL="0" distR="0">
             <wp:extent cx="5816600" cy="3778250"/>
             <wp:effectExtent l="0" t="0" r="0" b="0"/>
-            <wp:wrapSquare wrapText="largest"/>
             <wp:docPr id="1" name="Image10"/>
             <wp:cNvGraphicFramePr>
               <a:graphicFrameLocks xmlns:a="http://schemas.openxmlformats.org/drawingml/2006/main" noChangeAspect="1"/>
             </wp:cNvGraphicFramePr>
             <a:graphic xmlns:a="http://schemas.openxmlformats.org/drawingml/2006/main">
               <a:graphicData uri="http://schemas.openxmlformats.org/drawingml/2006/picture">
-                <pic:pic xmlns:pic="http://schemas.openxmlformats.org/drawingml/2006/picture">
+                <pic:pic>
                   <pic:nvPicPr>
                     <pic:cNvPr id="1" name="Image10"/>
                     <pic:cNvPicPr>
@@ -281,7 +273,7 @@
                 </pic:pic>
               </a:graphicData>
             </a:graphic>
-          </wp:anchor>
+          </wp:inline>
         </w:drawing>
       </w:r>
     </w:p>
@@ -1232,24 +1224,16 @@
       <w:r>
         <w:rPr/>
         <w:drawing>
-          <wp:anchor distT="0" distB="0" distL="0" distR="0" simplePos="0" relativeHeight="2" behindDoc="0" locked="0" layoutInCell="0" allowOverlap="1">
-            <wp:simplePos x="0" y="0"/>
-            <wp:positionH relativeFrom="column">
-              <wp:align>center</wp:align>
-            </wp:positionH>
-            <wp:positionV relativeFrom="paragraph">
-              <wp:posOffset>635</wp:posOffset>
-            </wp:positionV>
+          <wp:inline distT="0" distB="0" distL="0" distR="0">
             <wp:extent cx="6120130" cy="3230245"/>
             <wp:effectExtent l="0" t="0" r="0" b="0"/>
-            <wp:wrapSquare wrapText="largest"/>
             <wp:docPr id="2" name="Image2"/>
             <wp:cNvGraphicFramePr>
               <a:graphicFrameLocks xmlns:a="http://schemas.openxmlformats.org/drawingml/2006/main" noChangeAspect="1"/>
             </wp:cNvGraphicFramePr>
             <a:graphic xmlns:a="http://schemas.openxmlformats.org/drawingml/2006/main">
               <a:graphicData uri="http://schemas.openxmlformats.org/drawingml/2006/picture">
-                <pic:pic xmlns:pic="http://schemas.openxmlformats.org/drawingml/2006/picture">
+                <pic:pic>
                   <pic:nvPicPr>
                     <pic:cNvPr id="2" name="Image2"/>
                     <pic:cNvPicPr>
@@ -1275,7 +1259,7 @@
                 </pic:pic>
               </a:graphicData>
             </a:graphic>
-          </wp:anchor>
+          </wp:inline>
         </w:drawing>
       </w:r>
     </w:p>
@@ -1348,24 +1332,16 @@
       <w:r>
         <w:rPr/>
         <w:drawing>
-          <wp:anchor distT="0" distB="0" distL="0" distR="0" simplePos="0" relativeHeight="11" behindDoc="0" locked="0" layoutInCell="0" allowOverlap="1">
-            <wp:simplePos x="0" y="0"/>
-            <wp:positionH relativeFrom="column">
-              <wp:posOffset>4096385</wp:posOffset>
-            </wp:positionH>
-            <wp:positionV relativeFrom="paragraph">
-              <wp:posOffset>-11430</wp:posOffset>
-            </wp:positionV>
+          <wp:inline distT="0" distB="0" distL="0" distR="0">
             <wp:extent cx="1949450" cy="2044700"/>
             <wp:effectExtent l="0" t="0" r="0" b="0"/>
-            <wp:wrapSquare wrapText="largest"/>
             <wp:docPr id="3" name="Image1"/>
             <wp:cNvGraphicFramePr>
               <a:graphicFrameLocks xmlns:a="http://schemas.openxmlformats.org/drawingml/2006/main" noChangeAspect="1"/>
             </wp:cNvGraphicFramePr>
             <a:graphic xmlns:a="http://schemas.openxmlformats.org/drawingml/2006/main">
               <a:graphicData uri="http://schemas.openxmlformats.org/drawingml/2006/picture">
-                <pic:pic xmlns:pic="http://schemas.openxmlformats.org/drawingml/2006/picture">
+                <pic:pic>
                   <pic:nvPicPr>
                     <pic:cNvPr id="3" name="Image1"/>
                     <pic:cNvPicPr>
@@ -1391,7 +1367,7 @@
                 </pic:pic>
               </a:graphicData>
             </a:graphic>
-          </wp:anchor>
+          </wp:inline>
         </w:drawing>
       </w:r>
     </w:p>
@@ -1701,24 +1677,16 @@
       <w:r>
         <w:rPr/>
         <w:drawing>
-          <wp:anchor distT="0" distB="0" distL="0" distR="0" simplePos="0" relativeHeight="3" behindDoc="0" locked="0" layoutInCell="0" allowOverlap="1">
-            <wp:simplePos x="0" y="0"/>
-            <wp:positionH relativeFrom="column">
-              <wp:posOffset>3910965</wp:posOffset>
-            </wp:positionH>
-            <wp:positionV relativeFrom="paragraph">
-              <wp:posOffset>83185</wp:posOffset>
-            </wp:positionV>
+          <wp:inline distT="0" distB="0" distL="0" distR="0">
             <wp:extent cx="2743200" cy="3048000"/>
             <wp:effectExtent l="0" t="0" r="0" b="0"/>
-            <wp:wrapSquare wrapText="largest"/>
             <wp:docPr id="4" name="Image3"/>
             <wp:cNvGraphicFramePr>
               <a:graphicFrameLocks xmlns:a="http://schemas.openxmlformats.org/drawingml/2006/main" noChangeAspect="1"/>
             </wp:cNvGraphicFramePr>
             <a:graphic xmlns:a="http://schemas.openxmlformats.org/drawingml/2006/main">
               <a:graphicData uri="http://schemas.openxmlformats.org/drawingml/2006/picture">
-                <pic:pic xmlns:pic="http://schemas.openxmlformats.org/drawingml/2006/picture">
+                <pic:pic>
                   <pic:nvPicPr>
                     <pic:cNvPr id="4" name="Image3"/>
                     <pic:cNvPicPr>
@@ -1744,7 +1712,7 @@
                 </pic:pic>
               </a:graphicData>
             </a:graphic>
-          </wp:anchor>
+          </wp:inline>
         </w:drawing>
       </w:r>
     </w:p>
@@ -1848,24 +1816,16 @@
       <w:r>
         <w:rPr/>
         <w:drawing>
-          <wp:anchor distT="0" distB="0" distL="0" distR="0" simplePos="0" relativeHeight="4" behindDoc="0" locked="0" layoutInCell="0" allowOverlap="1">
-            <wp:simplePos x="0" y="0"/>
-            <wp:positionH relativeFrom="column">
-              <wp:posOffset>3622040</wp:posOffset>
-            </wp:positionH>
-            <wp:positionV relativeFrom="paragraph">
-              <wp:posOffset>81280</wp:posOffset>
-            </wp:positionV>
+          <wp:inline distT="0" distB="0" distL="0" distR="0">
             <wp:extent cx="2609850" cy="2025650"/>
             <wp:effectExtent l="0" t="0" r="0" b="0"/>
-            <wp:wrapSquare wrapText="largest"/>
             <wp:docPr id="5" name="Image4"/>
             <wp:cNvGraphicFramePr>
               <a:graphicFrameLocks xmlns:a="http://schemas.openxmlformats.org/drawingml/2006/main" noChangeAspect="1"/>
             </wp:cNvGraphicFramePr>
             <a:graphic xmlns:a="http://schemas.openxmlformats.org/drawingml/2006/main">
               <a:graphicData uri="http://schemas.openxmlformats.org/drawingml/2006/picture">
-                <pic:pic xmlns:pic="http://schemas.openxmlformats.org/drawingml/2006/picture">
+                <pic:pic>
                   <pic:nvPicPr>
                     <pic:cNvPr id="5" name="Image4"/>
                     <pic:cNvPicPr>
@@ -1891,7 +1851,7 @@
                 </pic:pic>
               </a:graphicData>
             </a:graphic>
-          </wp:anchor>
+          </wp:inline>
         </w:drawing>
       </w:r>
     </w:p>
@@ -2101,24 +2061,16 @@
       <w:r>
         <w:rPr/>
         <w:drawing>
-          <wp:anchor distT="0" distB="0" distL="0" distR="0" simplePos="0" relativeHeight="8" behindDoc="0" locked="0" layoutInCell="0" allowOverlap="1">
-            <wp:simplePos x="0" y="0"/>
-            <wp:positionH relativeFrom="column">
-              <wp:align>center</wp:align>
-            </wp:positionH>
-            <wp:positionV relativeFrom="paragraph">
-              <wp:posOffset>635</wp:posOffset>
-            </wp:positionV>
+          <wp:inline distT="0" distB="0" distL="0" distR="0">
             <wp:extent cx="5111750" cy="3587750"/>
             <wp:effectExtent l="0" t="0" r="0" b="0"/>
-            <wp:wrapSquare wrapText="largest"/>
             <wp:docPr id="6" name="Image7"/>
             <wp:cNvGraphicFramePr>
               <a:graphicFrameLocks xmlns:a="http://schemas.openxmlformats.org/drawingml/2006/main" noChangeAspect="1"/>
             </wp:cNvGraphicFramePr>
             <a:graphic xmlns:a="http://schemas.openxmlformats.org/drawingml/2006/main">
               <a:graphicData uri="http://schemas.openxmlformats.org/drawingml/2006/picture">
-                <pic:pic xmlns:pic="http://schemas.openxmlformats.org/drawingml/2006/picture">
+                <pic:pic>
                   <pic:nvPicPr>
                     <pic:cNvPr id="6" name="Image7"/>
                     <pic:cNvPicPr>
@@ -2144,7 +2096,7 @@
                 </pic:pic>
               </a:graphicData>
             </a:graphic>
-          </wp:anchor>
+          </wp:inline>
         </w:drawing>
       </w:r>
     </w:p>
@@ -2537,24 +2489,16 @@
       <w:r>
         <w:rPr/>
         <w:drawing>
-          <wp:anchor distT="0" distB="0" distL="0" distR="0" simplePos="0" relativeHeight="9" behindDoc="0" locked="0" layoutInCell="0" allowOverlap="1">
-            <wp:simplePos x="0" y="0"/>
-            <wp:positionH relativeFrom="column">
-              <wp:align>center</wp:align>
-            </wp:positionH>
-            <wp:positionV relativeFrom="paragraph">
-              <wp:posOffset>635</wp:posOffset>
-            </wp:positionV>
+          <wp:inline distT="0" distB="0" distL="0" distR="0">
             <wp:extent cx="5568950" cy="5302250"/>
             <wp:effectExtent l="0" t="0" r="0" b="0"/>
-            <wp:wrapSquare wrapText="largest"/>
             <wp:docPr id="7" name="Image8"/>
             <wp:cNvGraphicFramePr>
               <a:graphicFrameLocks xmlns:a="http://schemas.openxmlformats.org/drawingml/2006/main" noChangeAspect="1"/>
             </wp:cNvGraphicFramePr>
             <a:graphic xmlns:a="http://schemas.openxmlformats.org/drawingml/2006/main">
               <a:graphicData uri="http://schemas.openxmlformats.org/drawingml/2006/picture">
-                <pic:pic xmlns:pic="http://schemas.openxmlformats.org/drawingml/2006/picture">
+                <pic:pic>
                   <pic:nvPicPr>
                     <pic:cNvPr id="7" name="Image8"/>
                     <pic:cNvPicPr>
@@ -2580,7 +2524,7 @@
                 </pic:pic>
               </a:graphicData>
             </a:graphic>
-          </wp:anchor>
+          </wp:inline>
         </w:drawing>
       </w:r>
     </w:p>
@@ -2712,24 +2656,16 @@
       <w:r>
         <w:rPr/>
         <w:drawing>
-          <wp:anchor distT="0" distB="0" distL="0" distR="0" simplePos="0" relativeHeight="5" behindDoc="0" locked="0" layoutInCell="0" allowOverlap="1">
-            <wp:simplePos x="0" y="0"/>
-            <wp:positionH relativeFrom="column">
-              <wp:posOffset>1710690</wp:posOffset>
-            </wp:positionH>
-            <wp:positionV relativeFrom="paragraph">
-              <wp:posOffset>249555</wp:posOffset>
-            </wp:positionV>
+          <wp:inline distT="0" distB="0" distL="0" distR="0">
             <wp:extent cx="4768850" cy="2266950"/>
             <wp:effectExtent l="0" t="0" r="0" b="0"/>
-            <wp:wrapSquare wrapText="largest"/>
             <wp:docPr id="8" name="Image5"/>
             <wp:cNvGraphicFramePr>
               <a:graphicFrameLocks xmlns:a="http://schemas.openxmlformats.org/drawingml/2006/main" noChangeAspect="1"/>
             </wp:cNvGraphicFramePr>
             <a:graphic xmlns:a="http://schemas.openxmlformats.org/drawingml/2006/main">
               <a:graphicData uri="http://schemas.openxmlformats.org/drawingml/2006/picture">
-                <pic:pic xmlns:pic="http://schemas.openxmlformats.org/drawingml/2006/picture">
+                <pic:pic>
                   <pic:nvPicPr>
                     <pic:cNvPr id="8" name="Image5"/>
                     <pic:cNvPicPr>
@@ -2755,7 +2691,7 @@
                 </pic:pic>
               </a:graphicData>
             </a:graphic>
-          </wp:anchor>
+          </wp:inline>
         </w:drawing>
       </w:r>
     </w:p>
@@ -2768,42 +2704,6 @@
           <w:i/>
         </w:rPr>
         <w:t xml:space="preserve">Figure 8: Workbench 1</w:t>
-      </w:r>
-    </w:p>
-    <w:p>
-      <w:pPr>
-        <w:pStyle w:val="BodyText"/>
-        <w:bidi w:val="0"/>
-        <w:spacing w:lineRule="auto" w:line="276" w:before="0" w:after="140"/>
-        <w:jc w:val="start"/>
-        <w:rPr/>
-      </w:pPr>
-      <w:r>
-        <w:rPr/>
-      </w:r>
-    </w:p>
-    <w:p>
-      <w:pPr>
-        <w:pStyle w:val="BodyText"/>
-        <w:bidi w:val="0"/>
-        <w:spacing w:lineRule="auto" w:line="276" w:before="0" w:after="140"/>
-        <w:jc w:val="start"/>
-        <w:rPr/>
-      </w:pPr>
-      <w:r>
-        <w:rPr/>
-      </w:r>
-    </w:p>
-    <w:p>
-      <w:pPr>
-        <w:pStyle w:val="BodyText"/>
-        <w:bidi w:val="0"/>
-        <w:spacing w:lineRule="auto" w:line="276" w:before="0" w:after="140"/>
-        <w:jc w:val="start"/>
-        <w:rPr/>
-      </w:pPr>
-      <w:r>
-        <w:rPr/>
       </w:r>
     </w:p>
     <w:p>
@@ -3732,24 +3632,16 @@
       <w:r>
         <w:rPr/>
         <w:drawing>
-          <wp:anchor distT="0" distB="0" distL="0" distR="0" simplePos="0" relativeHeight="6" behindDoc="0" locked="0" layoutInCell="0" allowOverlap="1">
-            <wp:simplePos x="0" y="0"/>
-            <wp:positionH relativeFrom="column">
-              <wp:posOffset>2543175</wp:posOffset>
-            </wp:positionH>
-            <wp:positionV relativeFrom="paragraph">
-              <wp:posOffset>635</wp:posOffset>
-            </wp:positionV>
+          <wp:inline distT="0" distB="0" distL="0" distR="0">
             <wp:extent cx="3936365" cy="2806700"/>
             <wp:effectExtent l="0" t="0" r="0" b="0"/>
-            <wp:wrapSquare wrapText="largest"/>
             <wp:docPr id="9" name="Image6"/>
             <wp:cNvGraphicFramePr>
               <a:graphicFrameLocks xmlns:a="http://schemas.openxmlformats.org/drawingml/2006/main" noChangeAspect="1"/>
             </wp:cNvGraphicFramePr>
             <a:graphic xmlns:a="http://schemas.openxmlformats.org/drawingml/2006/main">
               <a:graphicData uri="http://schemas.openxmlformats.org/drawingml/2006/picture">
-                <pic:pic xmlns:pic="http://schemas.openxmlformats.org/drawingml/2006/picture">
+                <pic:pic>
                   <pic:nvPicPr>
                     <pic:cNvPr id="9" name="Image6"/>
                     <pic:cNvPicPr>
@@ -3775,7 +3667,7 @@
                 </pic:pic>
               </a:graphicData>
             </a:graphic>
-          </wp:anchor>
+          </wp:inline>
         </w:drawing>
       </w:r>
     </w:p>
@@ -5659,24 +5551,16 @@
       </w:pPr>
       <w:r>
         <w:drawing>
-          <wp:anchor distT="0" distB="0" distL="0" distR="0" simplePos="0" relativeHeight="7" behindDoc="0" locked="0" layoutInCell="0" allowOverlap="1">
-            <wp:simplePos x="0" y="0"/>
-            <wp:positionH relativeFrom="column">
-              <wp:posOffset>-220345</wp:posOffset>
-            </wp:positionH>
-            <wp:positionV relativeFrom="paragraph">
-              <wp:posOffset>-159385</wp:posOffset>
-            </wp:positionV>
+          <wp:inline distT="0" distB="0" distL="0" distR="0">
             <wp:extent cx="1683385" cy="2075180"/>
             <wp:effectExtent l="0" t="0" r="0" b="0"/>
-            <wp:wrapSquare wrapText="largest"/>
             <wp:docPr id="10" name="Image9"/>
             <wp:cNvGraphicFramePr>
               <a:graphicFrameLocks xmlns:a="http://schemas.openxmlformats.org/drawingml/2006/main" noChangeAspect="1"/>
             </wp:cNvGraphicFramePr>
             <a:graphic xmlns:a="http://schemas.openxmlformats.org/drawingml/2006/main">
               <a:graphicData uri="http://schemas.openxmlformats.org/drawingml/2006/picture">
-                <pic:pic xmlns:pic="http://schemas.openxmlformats.org/drawingml/2006/picture">
+                <pic:pic>
                   <pic:nvPicPr>
                     <pic:cNvPr id="10" name="Image9"/>
                     <pic:cNvPicPr>
@@ -5702,7 +5586,7 @@
                 </pic:pic>
               </a:graphicData>
             </a:graphic>
-          </wp:anchor>
+          </wp:inline>
         </w:drawing>
       </w:r>
       <w:r>
@@ -20008,7 +19892,7 @@
         <w:spacing w:after="120"/>
       </w:pPr>
       <w:r>
-        <w:t xml:space="preserve">10_calculator_four_function.asm — the keypad state-machine pattern this program reuses almost line for line, and the Carry-flag quirk of plain SUB/CMPA (see Section 5 for why BCD is different).</w:t>
+        <w:t>10_calculator_four_function.asm — the keypad state-machine pattern this program reuses almost line for line, and the Carry-flag quirk of plain SUB/CMPA (see “Subtraction: DSUB’s Carry Means the Opposite of SUB/CMPA’s” for why BCD is different).</w:t>
       </w:r>
     </w:p>
     <w:p>

</xml_diff>